<commit_message>
Publish synchronized Klingon and Neo-Quenya editions
</commit_message>
<xml_diff>
--- a/site/files/qya/between-potential-and-ideal-qya.docx
+++ b/site/files/qya/between-potential-and-ideal-qya.docx
@@ -478,11 +478,6 @@
     </w:p>
     <w:p>
       <w:r>
-        <w:t>Image description draft: carma sanwëo lá telyaina, tamma tiello ar tië pantaina ana aurë calima; i emma tana patar mauya-cáriëo, lúmava ar cestaina, lá nyárë tancaina metta.</w:t>
-      </w:r>
-    </w:p>
-    <w:p>
-      <w:r>
         <w:t>Mapa mauya-cáriëo, lá lavë úvissë tancaina</w:t>
       </w:r>
     </w:p>
@@ -845,11 +840,6 @@
     </w:p>
     <w:p>
       <w:r>
-        <w:t>Image description draft: i Quanta lá auta rantaryar; i nacca imbetenta ontë ovantë, canta cuina ar mauya-cárië.</w:t>
-      </w:r>
-    </w:p>
-    <w:p>
-      <w:r>
         <w:t>Cendë sina anta i sanwë-pataren tië carmava: anwië lá ná ocombë rantaron hyanë, mal lindalë er yassë ilya rinca colë mahalma hyana. I quén, i Ambar, lamani, olvar ar handassë lá tarir pella i Quanta. Nar tier hyanë yainen i Celumë er tulë cenna, lelya haiya immollo, ar cesta entulë immo ter hirnië.</w:t>
       </w:r>
     </w:p>
@@ -966,11 +956,6 @@
     </w:p>
     <w:p>
       <w:r>
-        <w:t>Image description draft: astarmo, yantë hlóno, cilintë ar hanyalië — i anwië ná cendaina ú autala i haiya i celu cuinallo.</w:t>
-      </w:r>
-    </w:p>
-    <w:p>
-      <w:r>
         <w:t>Nótië-carindollo ana Astarmo i Celumëo</w:t>
       </w:r>
     </w:p>
@@ -1563,11 +1548,6 @@
       </w:r>
     </w:p>
     <w:p>
-      <w:r>
-        <w:t>Image description draft: parmalë, haiya ar hanyalië ya lá ná tië sinta.</w:t>
-      </w:r>
-    </w:p>
-    <w:p>
       <w:pPr>
         <w:pStyle w:val="Heading3"/>
       </w:pPr>
@@ -1930,11 +1910,6 @@
     </w:p>
     <w:p>
       <w:r>
-        <w:t>Image description draft: cenë er varyaina mi i Quanta, lá autaina ar lá rentaina.</w:t>
-      </w:r>
-    </w:p>
-    <w:p>
-      <w:r>
         <w:t>Cenë varyaina mi i Quanta</w:t>
       </w:r>
     </w:p>
@@ -2611,11 +2586,6 @@
       </w:r>
     </w:p>
     <w:p>
-      <w:r>
-        <w:t>Image description draft: hanquenta, celu, mauya-cárië ar haiya ya polë ná mapaina.</w:t>
-      </w:r>
-    </w:p>
-    <w:p>
       <w:pPr>
         <w:pStyle w:val="Heading3"/>
       </w:pPr>
@@ -2813,11 +2783,6 @@
       </w:r>
     </w:p>
     <w:p>
-      <w:r>
-        <w:t>Image description draft: i nyárë, i tyalië, metta pahtaina ar metta yassë carië en polë ná.</w:t>
-      </w:r>
-    </w:p>
-    <w:p>
       <w:pPr>
         <w:pStyle w:val="Heading3"/>
       </w:pPr>
@@ -2960,11 +2925,6 @@
     </w:p>
     <w:p>
       <w:r>
-        <w:t>Image description draft: carma recursive yassë ilya layer polë ahya celu, palar, námië ar ambar local.</w:t>
-      </w:r>
-    </w:p>
-    <w:p>
-      <w:r>
         <w:t>Epë cendë lelya mir i model, rénaryar mauya ná tancainë: i neldë layers sís lá nar i neldë anwiër er i Ëao. Nar neldë lambeli parallel imbe lambeli úmetta yainen i axan recursive er polë ná quétina. I movement er polë ná ahyaina ter carma stateo: sovereignty, institutions, laws, citizens, borders, crisis astariéo ar constitutional repair. Polë ná ahyaina ter economy: currency, debt, credit, inflation, market, labor, scarcity, surplus ar balance. Polë yando ter psychology: stages insighto mi cuilë quénwa, lúmi yassen quén harya hanyalië anwa lúmen tana, rista sello, ná reformaina ar ontaina mir námië tancavë amba — entulë consciousnesso mi cuilë er. Law, family, city, ecology, music hya political body polir tana ranta hyana i carma er.</w:t>
       </w:r>
     </w:p>
@@ -3760,11 +3720,6 @@
       </w:r>
     </w:p>
     <w:p>
-      <w:r>
-        <w:t>Image description draft: layers recursive yassen ilya réna polë ahya celu vinya.</w:t>
-      </w:r>
-    </w:p>
-    <w:p>
       <w:pPr>
         <w:pStyle w:val="Heading3"/>
       </w:pPr>
@@ -4644,11 +4599,6 @@
       </w:r>
     </w:p>
     <w:p>
-      <w:r>
-        <w:t>Image description draft: formulas, measurement ar models ve lambeli boundaryo, lá proof final.</w:t>
-      </w:r>
-    </w:p>
-    <w:p>
       <w:pPr>
         <w:pStyle w:val="Heading3"/>
       </w:pPr>
@@ -4811,11 +4761,6 @@
     </w:p>
     <w:p>
       <w:r>
-        <w:t>Image description draft: local ar non-local relations, measurement, i conditions yassen tana ná cendaina, ar correlations yar lá nar messages.</w:t>
-      </w:r>
-    </w:p>
-    <w:p>
-      <w:r>
         <w:t>Correlation lá ná message, ar i conditions i answero lá nar noise. Sin nar i attë warnings ú yar locality, non-locality ar contextuality lá polir ná used responsibly. Cendë sina lá cesta prove i theory ter quantum mechanics, ar lá cesta carë Bell, Kochen-Specker, Bohmian mechanics hya measurement philosophical slogans. Cesta parma sello discipline appearanceo: mana polë ná quétina natten írë i lé yassë ná measured, maquetaina ar carna appear ná ranta i conditions i answero?</w:t>
       </w:r>
     </w:p>
@@ -5395,11 +5340,6 @@
     </w:p>
     <w:p>
       <w:r>
-        <w:t>Image description draft: figure rácina os center calo, ve form cilina excess possibilityo.</w:t>
-      </w:r>
-    </w:p>
-    <w:p>
-      <w:r>
         <w:t>Creation ná min i laboratories amba precise i relationo imbe Potential ar Ideal, an nasca excessello. Epë book, film, series, comic, game hya creative franchise, ëa field possibilitieso ya ná too wide: characters, plots, endings, worlds, styles, voices ar modes appearanceo. Creation an sina lá ná er act additiono; ná yando act relinquishmento.</w:t>
       </w:r>
     </w:p>
@@ -5882,11 +5822,6 @@
       </w:r>
     </w:p>
     <w:p>
-      <w:r>
-        <w:t>Image description draft: creation ve field yassë possibility receives form ú nauva fully closed.</w:t>
-      </w:r>
-    </w:p>
-    <w:p>
       <w:pPr>
         <w:pStyle w:val="Heading3"/>
       </w:pPr>
@@ -5951,11 +5886,6 @@
       </w:r>
     </w:p>
     <w:p>
-      <w:r>
-        <w:t>Image description draft: rhythm, silence ar return ve ways carrying possibility ter time.</w:t>
-      </w:r>
-    </w:p>
-    <w:p>
       <w:pPr>
         <w:pStyle w:val="Heading3"/>
       </w:pPr>
@@ -6016,11 +5946,6 @@
     </w:p>
     <w:p>
       <w:r>
-        <w:t>Image description draft: engineered system yassë Potential becomes structure, channeling, testing ar repair.</w:t>
-      </w:r>
-    </w:p>
-    <w:p>
-      <w:r>
         <w:t>From outside, engineering looks ve discipline calculationo: loads, dimensions, materials, codes, ratios yar hehtar room erroren, forces, sections ar drawings. Architecture looks ve discipline formo: lines, facades, spaces, light, movement, proportion ar beauty.</w:t>
       </w:r>
     </w:p>
@@ -6658,11 +6583,6 @@
     </w:p>
     <w:p>
       <w:r>
-        <w:t>Image description draft: value, exchange ar responsibility ve living relations, lá er numbers.</w:t>
-      </w:r>
-    </w:p>
-    <w:p>
-      <w:r>
         <w:t>From outside, economy looks ve field numberso: money, prices, interest, wages, debt, inflation, growth ar exchange rates. Mal under ilyë numbers stands deeper maquetta:</w:t>
       </w:r>
     </w:p>
@@ -7601,11 +7521,6 @@
     </w:p>
     <w:p>
       <w:r>
-        <w:t>Image description draft: institutions, decision ar public coordination ve ways translating possibility into responsibility.</w:t>
-      </w:r>
-    </w:p>
-    <w:p>
-      <w:r>
         <w:t>From outside, governance looks ve field institutionso: government, law, courts, police, military, budgets, elections, committees, procedures, offices, regulations, rights ar duties. Society looks ve collection peopleo, groups, interests, memories, fears, desires ar hopes.</w:t>
       </w:r>
     </w:p>
@@ -8182,11 +8097,6 @@
       </w:r>
     </w:p>
     <w:p>
-      <w:r>
-        <w:t>Image description draft: law, interpretation ar boundary ve space yassë possibility ná tested against responsibility.</w:t>
-      </w:r>
-    </w:p>
-    <w:p>
       <w:pPr>
         <w:pStyle w:val="Heading3"/>
       </w:pPr>
@@ -8703,11 +8613,6 @@
       </w:r>
     </w:p>
     <w:p>
-      <w:r>
-        <w:t>Image description draft: healing ve careful reading bodyo, sufferingo, chanceo ar conditionso.</w:t>
-      </w:r>
-    </w:p>
-    <w:p>
       <w:pPr>
         <w:pStyle w:val="Heading3"/>
       </w:pPr>
@@ -9276,11 +9181,6 @@
       </w:r>
     </w:p>
     <w:p>
-      <w:r>
-        <w:t>Image description draft: boundary ya lá merely wall, mal horizon guiding i relation imbe possibility ar form.</w:t>
-      </w:r>
-    </w:p>
-    <w:p>
       <w:pPr>
         <w:pStyle w:val="Heading3"/>
       </w:pPr>
@@ -10243,11 +10143,6 @@
     </w:p>
     <w:p>
       <w:r>
-        <w:t>Image description: horizon, visible ar hidden field, ar possibilities ya cannot be fully accessed from one viewpoint.</w:t>
-      </w:r>
-    </w:p>
-    <w:p>
-      <w:r>
         <w:t>Chapter sina does lá try prove i theory through i universe. I shape i universeo is lá i shape Potentialo, ar cosmology is lá moral metaphysics. Mal cosmological language teaches something i theory needs: manen think, choose ar act from within horizon, yá i visible part is lá i whole system, yá i local does lá decide i global by itself, ar yá boundary accesso is lá necessarily falsehood, prison hya end.</w:t>
       </w:r>
     </w:p>
@@ -10607,11 +10502,6 @@
     </w:p>
     <w:p>
       <w:r>
-        <w:t>Image description draft: abstract traces, tracks, scale, and experimental field as a boundary of appearance and measurement.</w:t>
-      </w:r>
-    </w:p>
-    <w:p>
-      <w:r>
         <w:t>Chapter sina does lá try prove i theory through high-energy physics. It does lá say Potential is energy, i Ideal perfect symmetry, hya i Optimal physical unification all forceso. Such claims would turn physics into borrowed authority instead learning discipline from sa.</w:t>
       </w:r>
     </w:p>
@@ -11001,11 +10891,6 @@
     <w:p>
       <w:r>
         <w:t>Boundary, information, accessibility, and traces — without turning physics into metaphysical proof</w:t>
-      </w:r>
-    </w:p>
-    <w:p>
-      <w:r>
-        <w:t>Image description: horizon, information, ar threshold yassë mana disappears still leaves structural trace.</w:t>
       </w:r>
     </w:p>
     <w:p>

</xml_diff>